<commit_message>
cmcr opening-brief, answering-brief typst, docx: number the table of contents i, so only the cover is unnumbered (DEF-COVER-001)
The contents page printed no number, so the cover read as two pages and the body started at 1 on physical page 3.
No CMCR rule (Rule 15, APP-1) leaves the contents unnumbered, and the filed opening briefs number it (i on
FILED-EXAMPLE-opening-brief, ii with the cover counted on -2), so rather than declare cover_pages: 2 the contents
now prints i. typst: the page-number footer starts at the contents with roman numbering, the body switches to
arabic from 1. docx: the cover is its own section with rIdFtrNone, the contents a lowerRoman section on
rIdFtrPage. No line or page break moves. check.sh typst 9/0 and docx 13/0 on both (XENG-001..003 pass, the folders
are gated). (fb-595.73.1)
</commit_message>
<xml_diff>
--- a/courts/military/court-of-military-commission-review/answering-brief/usage/OUTPUT-answering-brief.docx
+++ b/courts/military/court-of-military-commission-review/answering-brief/usage/OUTPUT-answering-brief.docx
@@ -1277,6 +1277,16 @@
     </w:p>
     <w:p>
       <w:pPr>
+        <w:spacing w:before="0" w:after="0" w:line="20" w:lineRule="exact"/>
+        <w:sectPr>
+          <w:footerReference w:type="default" r:id="rIdFtrNone"/>
+          <w:pgSz w:w="12240" w:h="15840"/>
+          <w:pgMar w:top="1440" w:right="1440" w:bottom="1440" w:left="1440" w:header="720" w:footer="720" w:gutter="0"/>
+        </w:sectPr>
+      </w:pPr>
+    </w:p>
+    <w:p>
+      <w:pPr>
         <w:pageBreakBefore/>
         <w:spacing w:before="0" w:after="240" w:line="276" w:lineRule="exact"/>
         <w:ind w:left="0" w:firstLine="0"/>
@@ -1584,9 +1594,10 @@
       <w:pPr>
         <w:spacing w:before="0" w:after="0" w:line="20" w:lineRule="exact"/>
         <w:sectPr>
-          <w:footerReference w:type="default" r:id="rIdFtrNone"/>
+          <w:footerReference w:type="default" r:id="rIdFtrPage"/>
           <w:pgSz w:w="12240" w:h="15840"/>
           <w:pgMar w:top="1440" w:right="1440" w:bottom="1440" w:left="1440" w:header="720" w:footer="720" w:gutter="0"/>
+          <w:pgNumType w:fmt="lowerRoman" w:start="1"/>
         </w:sectPr>
       </w:pPr>
     </w:p>

</xml_diff>